<commit_message>
Taqrizdagi diplom ko'rsatkichlari yangilandi
HFX hisob-kitoblari olib tashlangach diplom 84 bet, 41 rasm, 17 jadval
va 1 formulaga tushdi. Taqriz va rahbar xulosasi qayta yaratildi.

Co-Authored-By: Claude Opus 5.5 <noreply@anthropic.com>
</commit_message>
<xml_diff>
--- a/diplom/Taqriz_Sohinazarov_Sardor.docx
+++ b/diplom/Taqriz_Sohinazarov_Sardor.docx
@@ -77,7 +77,7 @@
         <w:jc w:val="both"/>
       </w:pPr>
       <w:r>
-        <w:t xml:space="preserve">Diplom loyihasi 89 betdan iborat bo‘lib, </w:t>
+        <w:t xml:space="preserve">Diplom loyihasi 84 betdan iborat bo‘lib, </w:t>
       </w:r>
       <w:r>
         <w:rPr>
@@ -127,7 +127,7 @@
         <w:t xml:space="preserve">ilovalardan</w:t>
       </w:r>
       <w:r>
-        <w:t xml:space="preserve"> tashkil topgan. Loyihada 42 ta rasm, 19 ta jadval, 10 ta formula va 5 ta ilova keltirilgan.</w:t>
+        <w:t xml:space="preserve"> tashkil topgan. Loyihada 41 ta rasm, 17 ta jadval, 1 ta formula va 5 ta ilova keltirilgan.</w:t>
       </w:r>
     </w:p>
     <w:p>

</xml_diff>